<commit_message>
Research: one content plan per course for all 16 courses
Adds the remaining plans (Device Upgrade, Device Health Monitoring,
Cisco ACI Upgrade, Traffic and Flow Diagram, Terraform and GitHub,
Certificate Renewal), replaces the combined research document with
an index grouped by domain, and adds research paths to courses.json.

Co-Authored-By: Claude Opus 5.5 <noreply@anthropic.com>
Claude-Session: https://claude.ai/code/session_01AnNjVdUt7zLue4GreZ19rC
</commit_message>
<xml_diff>
--- a/TOC-output/Device Upgrade Automation with Claude/Research/Device Upgrade Automation with Claude - Research and Content Plan.docx
+++ b/TOC-output/Device Upgrade Automation with Claude/Research/Device Upgrade Automation with Claude - Research and Content Plan.docx
@@ -136,7 +136,7 @@
           </w:tcPr>
           <w:p>
             <w:r>
-              <w:t>Fold the client's separate Cisco ACI use case into a dedicated module</w:t>
+              <w:t>Include one Cisco ACI module in a multi-vendor course</w:t>
             </w:r>
           </w:p>
         </w:tc>
@@ -146,7 +146,7 @@
           </w:tcPr>
           <w:p>
             <w:r>
-              <w:t>Use case 10 asks for ACI upgrades 'as per process suggested by Cisco'; the module follows Cisco's pre-upgrade checklist and validator [20][21] rather than inventing a process.</w:t>
+              <w:t>Use case 10 asks for ACI upgrades 'as per process suggested by Cisco' and has its own dedicated course; here one module shows how ACI fits the same lifecycle, following Cisco's pre-upgrade checklist and validator [20][21] rather than inventing a process, and leaves depth to the dedicated ACI course.</w:t>
             </w:r>
           </w:p>
         </w:tc>

</xml_diff>